<commit_message>
docs(rating-model): say what the K column is, instead of promising a warning
The federation marked this passage with "????", and the reason turns out to
be that it did not explain itself: it promised that "the file header and the
README say so in so many words". A CSV header is a row of column names, not
a place for a sentence, and the README is a developer document nobody on the
board will open. It was hand-waving - "we will warn somewhere" - written
before deciding where.

Replaced with the fact that makes the warning unnecessary: the column is
output, rewritten every cycle, so a hand edit changes nothing in that cycle
and is gone on the next run. The mechanism enforces itself.

Also drops the presumption in the closing line. It said the permanence of
K=10 "pede campo próprio", which is this side's recommendation, not a
settled rule - how that datum is stored is open point 1, and the federation
has proposed reading it from the K column instead.
</commit_message>
<xml_diff>
--- a/docs/Modelo de rating FEXERJ - regras completas 1.4.docx
+++ b/docs/Modelo de rating FEXERJ - regras completas 1.4.docx
@@ -13868,28 +13868,32 @@
         <w:rPr/>
       </w:pPr>
       <w:r>
-        <w:rPr/>
-        <w:t xml:space="preserve">Consequência a registrar, porque o arquivo é lido e escrito pelo mesmo programa: o fator K é </w:t>
-      </w:r>
-      <w:r>
         <w:rPr>
           <w:rStyle w:val="Strong"/>
         </w:rPr>
-        <w:t>derivado</w:t>
-      </w:r>
-      <w:r>
-        <w:rPr/>
-        <w:t xml:space="preserve"> (vem do rating, da contagem de partidas e da data de nascimento, seção 5) e será </w:t>
-      </w:r>
+        <w:t>A coluna de fator K é saída.</w:t>
+      </w:r>
+      <w:r>
+        <w:rPr/>
+        <w:t xml:space="preserve"> O programa a reescreve a cada ciclo, calculando o K de cada jogador a partir do rating, da contagem de partidas e da data de nascimento (seção 5). Não é preciso avisar ninguém para não editá-la: uma edição manual não altera o cálculo daquele ciclo e desaparece na primeira execução seguinte, sobrescrita pelo valor calculado.</w:t>
+      </w:r>
+    </w:p>
+    <w:p>
+      <w:pPr>
+        <w:pStyle w:val="BodyText"/>
+        <w:bidi w:val="0"/>
+        <w:jc w:val="left"/>
+        <w:rPr/>
+      </w:pPr>
       <w:r>
         <w:rPr>
           <w:rStyle w:val="Strong"/>
         </w:rPr>
-        <w:t>recalculado a cada ciclo</w:t>
-      </w:r>
-      <w:r>
-        <w:rPr/>
-        <w:t>. A coluna existe para quem lê a lista, não para alimentar o cálculo — um K editado à mão não muda resultado nenhum. O cabeçalho do arquivo e o README dizem isso com todas as letras, para que ninguém edite a coluna esperando efeito.</w:t>
+        <w:t>Para que serve, então, uma coluna que o programa não lê:</w:t>
+      </w:r>
+      <w:r>
+        <w:rPr/>
+        <w:t xml:space="preserve"> para conferir. Ela mostra com que fator cada jogador foi calculado naquele ciclo, que é o número que explica o tamanho da variação dele. Sem ela, descobrir isso exige refazer a regra da seção 5 à mão, jogador a jogador. É o mesmo papel do rating publicado — é resultado, e é por ser resultado que serve de conferência.</w:t>
       </w:r>
     </w:p>
     <w:p>
@@ -13900,24 +13904,18 @@
         <w:rPr/>
       </w:pPr>
       <w:r>
+        <w:rPr/>
+        <w:t xml:space="preserve">Há um único dado que o cálculo </w:t>
+      </w:r>
+      <w:r>
         <w:rPr>
           <w:rStyle w:val="Strong"/>
         </w:rPr>
-        <w:t>Para que serve uma coluna que não alimenta o cálculo:</w:t>
-      </w:r>
-      <w:r>
-        <w:rPr/>
-        <w:t xml:space="preserve"> para conferir. Ela mostra com que fator cada jogador foi calculado naquele ciclo — o número que explica o tamanho da variação dele. Sem ela, descobrir isso exige refazer a regra da seção 5 à mão, jogador a jogador. É o mesmo papel do rating publicado: é resultado, e é por ser resultado que serve de conferência. O dado que o cálculo </w:t>
-      </w:r>
-      <w:r>
-        <w:rPr>
-          <w:rStyle w:val="Strong"/>
-        </w:rPr>
         <w:t>precisa</w:t>
       </w:r>
       <w:r>
         <w:rPr/>
-        <w:t xml:space="preserve"> guardar e não consegue deduzir é outro — a permanência do K=10 —, e é ele que pede campo próprio (ponto em aberto 1).</w:t>
+        <w:t xml:space="preserve"> conhecer e não consegue deduzir do arquivo: a permanência do K=10, isto é, que o jogador já atingiu 2.200 alguma vez, mesmo estando abaixo disso agora. Como esse dado é guardado — em campo próprio, ou lido do próprio K — é o ponto em aberto 1.</w:t>
       </w:r>
     </w:p>
     <w:p>

</xml_diff>